<commit_message>
docs(memorial): adiciona a seção de testes e a versão em PDF do Memorial
- Seção 3.4 (Estratégia de Testes): explica o método dos testes unitários e de ponta a
  ponta e traz exemplos reais de código de cada nível.
- Adiciona o Memorial Técnico em PDF (16 páginas), ao lado do docx, para leitura sem
  depender do Word.

Co-Authored-By: Claude Sonnet 5.5 <noreply@anthropic.com>
</commit_message>
<xml_diff>
--- a/docs/Memorial Técnico.docx
+++ b/docs/Memorial Técnico.docx
@@ -2332,6 +2332,284 @@
       <w:pPr>
         <w:spacing w:after="120"/>
       </w:pPr>
+    </w:p>
+    <w:p>
+      <w:pPr>
+        <w:pStyle w:val="Heading2"/>
+      </w:pPr>
+      <w:r>
+        <w:t>3.4. Estratégia de Testes</w:t>
+      </w:r>
+    </w:p>
+    <w:p>
+      <w:pPr>
+        <w:spacing w:after="160"/>
+        <w:jc w:val="both"/>
+      </w:pPr>
+      <w:r>
+        <w:t xml:space="preserve">A qualidade do back-end é verificada por testes automatizados em dois níveis, ambos executados com o Vitest: testes unitários, rápidos e isolados do banco de dados, e testes de ponta a ponta (e2e), que exercitam a API real, com requisições HTTP e um PostgreSQL de verdade. Os níveis se complementam: o primeiro localiza falhas de lógica com precisão e o segundo garante que as camadas funcionam juntas. No total são 292 testes unitários, executados com npm test, e 148 testes de ponta a ponta, executados com npm run test:e2e.</w:t>
+      </w:r>
+    </w:p>
+    <w:p>
+      <w:pPr>
+        <w:spacing w:after="160"/>
+        <w:jc w:val="both"/>
+      </w:pPr>
+      <w:r>
+        <w:rPr>
+          <w:b/>
+          <w:bCs/>
+        </w:rPr>
+        <w:t xml:space="preserve">Testes unitários. </w:t>
+      </w:r>
+      <w:r>
+        <w:t xml:space="preserve">Cada classe é testada isoladamente. O service é instanciado diretamente, sem o contêiner do NestJS, recebendo um PrismaService simulado, feito com funções de simulação (mocks) do Vitest. Isso permite controlar o que o banco responde em cada cenário e verificar o que o service tentou gravar. Os testes seguem o padrão preparar, executar e verificar, os mocks são reiniciados antes de cada caso e os nomes descrevem o comportamento esperado. Eles cobrem as regras de negócio (permissões por perfil, fluxo de status, trava de concorrência, chamado concluído somente leitura), os DTOs e os decoradores de validação, que são testados com o mesmo ValidationPipe da aplicação e com valores-limite (por exemplo, 255 e 256 caracteres), e as funções puras, como o cálculo de períodos do dashboard.</w:t>
+      </w:r>
+    </w:p>
+    <w:p>
+      <w:pPr>
+        <w:keepNext/>
+        <w:spacing w:before="120" w:after="80"/>
+      </w:pPr>
+      <w:r>
+        <w:rPr>
+          <w:b/>
+          <w:bCs/>
+        </w:rPr>
+        <w:t xml:space="preserve">Exemplo de teste unitário: o atendente que perde a corrida pela assunção recebe conflito e nada é gravado (comentarios.service.spec.ts)</w:t>
+      </w:r>
+    </w:p>
+    <w:p>
+      <w:pPr>
+        <w:pBdr>
+          <w:top w:val="single" w:sz="4" w:space="4" w:color="D0D0D0"/>
+          <w:left w:val="single" w:sz="4" w:space="4" w:color="D0D0D0"/>
+          <w:bottom w:val="single" w:sz="4" w:space="4" w:color="D0D0D0"/>
+          <w:right w:val="single" w:sz="4" w:space="4" w:color="D0D0D0"/>
+        </w:pBdr>
+        <w:shd w:val="clear" w:color="auto" w:fill="F5F5F5"/>
+        <w:spacing w:after="160" w:line="240" w:lineRule="auto"/>
+        <w:ind w:left="113" w:right="113"/>
+      </w:pPr>
+      <w:r>
+        <w:rPr>
+          <w:rFonts w:ascii="Consolas" w:hAnsi="Consolas" w:cs="Consolas" w:eastAsia="Consolas"/>
+          <w:sz w:val="18"/>
+          <w:szCs w:val="18"/>
+        </w:rPr>
+        <w:t xml:space="preserve">it('perdeu a corrida para outro atendente: 409 e nada é gravado', async () =&gt; {</w:t>
+        <w:br/>
+        <w:t xml:space="preserve">  findChamado</w:t>
+        <w:br/>
+        <w:t xml:space="preserve">    .mockResolvedValueOnce(aberto)</w:t>
+        <w:br/>
+        <w:t xml:space="preserve">    .mockResolvedValueOnce({</w:t>
+        <w:br/>
+        <w:t xml:space="preserve">      ...emAtendimento,</w:t>
+        <w:br/>
+        <w:t xml:space="preserve">      historico: [{ usuario: { id: 8, nome: 'Atendente Dois' } }],</w:t>
+        <w:br/>
+        <w:t xml:space="preserve">    });</w:t>
+        <w:br/>
+        <w:t xml:space="preserve">  updateMany.mockResolvedValue({ count: 0 });</w:t>
+        <w:br/>
+        <w:t xml:space="preserve"/>
+        <w:br/>
+        <w:t xml:space="preserve">  await expect(</w:t>
+        <w:br/>
+        <w:t xml:space="preserve">    service.criar(10, { texto: 'Oi' }, atendente),</w:t>
+        <w:br/>
+        <w:t xml:space="preserve">  ).rejects.toBeInstanceOf(ConflictException);</w:t>
+        <w:br/>
+        <w:t xml:space="preserve">  expect(criarComentario).not.toHaveBeenCalled();</w:t>
+        <w:br/>
+        <w:t xml:space="preserve">  expect(criarHistorico).not.toHaveBeenCalled();</w:t>
+        <w:br/>
+        <w:t xml:space="preserve">});</w:t>
+      </w:r>
+    </w:p>
+    <w:p>
+      <w:pPr>
+        <w:keepNext/>
+        <w:spacing w:before="120" w:after="80"/>
+      </w:pPr>
+      <w:r>
+        <w:rPr>
+          <w:b/>
+          <w:bCs/>
+        </w:rPr>
+        <w:t xml:space="preserve">Exemplo de teste de validação com valores-limite (comentarios.dto.spec.ts)</w:t>
+      </w:r>
+    </w:p>
+    <w:p>
+      <w:pPr>
+        <w:pBdr>
+          <w:top w:val="single" w:sz="4" w:space="4" w:color="D0D0D0"/>
+          <w:left w:val="single" w:sz="4" w:space="4" w:color="D0D0D0"/>
+          <w:bottom w:val="single" w:sz="4" w:space="4" w:color="D0D0D0"/>
+          <w:right w:val="single" w:sz="4" w:space="4" w:color="D0D0D0"/>
+        </w:pBdr>
+        <w:shd w:val="clear" w:color="auto" w:fill="F5F5F5"/>
+        <w:spacing w:after="160" w:line="240" w:lineRule="auto"/>
+        <w:ind w:left="113" w:right="113"/>
+      </w:pPr>
+      <w:r>
+        <w:rPr>
+          <w:rFonts w:ascii="Consolas" w:hAnsi="Consolas" w:cs="Consolas" w:eastAsia="Consolas"/>
+          <w:sz w:val="18"/>
+          <w:szCs w:val="18"/>
+        </w:rPr>
+        <w:t xml:space="preserve">it('aceita exatamente o limite e recusa um a mais', async () =&gt; {</w:t>
+        <w:br/>
+        <w:t xml:space="preserve">  await expect(corpo('a'.repeat(LIMITES.comentario))).resolves.toBeDefined();</w:t>
+        <w:br/>
+        <w:t xml:space="preserve">  await expect(corpo('a'.repeat(LIMITES.comentario + 1))).rejects.toBeInstanceOf(</w:t>
+        <w:br/>
+        <w:t xml:space="preserve">    BadRequestException,</w:t>
+        <w:br/>
+        <w:t xml:space="preserve">  );</w:t>
+        <w:br/>
+        <w:t xml:space="preserve">});</w:t>
+      </w:r>
+    </w:p>
+    <w:p>
+      <w:pPr>
+        <w:spacing w:after="160"/>
+        <w:jc w:val="both"/>
+      </w:pPr>
+      <w:r>
+        <w:rPr>
+          <w:b/>
+          <w:bCs/>
+        </w:rPr>
+        <w:t xml:space="preserve">Testes de ponta a ponta. </w:t>
+      </w:r>
+      <w:r>
+        <w:t xml:space="preserve">Os testes e2e sobem a aplicação completa em memória, a partir do módulo raiz e com a mesma configuração de produção (validação global e CORS), e disparam requisições HTTP com o Supertest contra um PostgreSQL real, com as migrações e o seed aplicados. Cada suíte cria os próprios dados, identificados por um marcador único, e os remove ao final, de modo que o banco continua como estava. Além da resposta HTTP, os testes consultam o banco diretamente para confirmar o efeito da operação, como o histórico gravado, a exclusão lógica e as revisões dos comentários. Os cenários de concorrência são simulados com requisições simultâneas, verificando que apenas uma vence. Esses testes cobrem a matriz de respostas (400, 401, 403, 404 e 409), os limites de validação, a revalidação com ETag, a paginação e os filtros, o dashboard e a comunicação no chamado.</w:t>
+      </w:r>
+    </w:p>
+    <w:p>
+      <w:pPr>
+        <w:keepNext/>
+        <w:spacing w:before="120" w:after="80"/>
+      </w:pPr>
+      <w:r>
+        <w:rPr>
+          <w:b/>
+          <w:bCs/>
+        </w:rPr>
+        <w:t xml:space="preserve">Preparação: a aplicação real é montada com a configuração de produção (test/app.e2e-spec.ts)</w:t>
+      </w:r>
+    </w:p>
+    <w:p>
+      <w:pPr>
+        <w:pBdr>
+          <w:top w:val="single" w:sz="4" w:space="4" w:color="D0D0D0"/>
+          <w:left w:val="single" w:sz="4" w:space="4" w:color="D0D0D0"/>
+          <w:bottom w:val="single" w:sz="4" w:space="4" w:color="D0D0D0"/>
+          <w:right w:val="single" w:sz="4" w:space="4" w:color="D0D0D0"/>
+        </w:pBdr>
+        <w:shd w:val="clear" w:color="auto" w:fill="F5F5F5"/>
+        <w:spacing w:after="160" w:line="240" w:lineRule="auto"/>
+        <w:ind w:left="113" w:right="113"/>
+      </w:pPr>
+      <w:r>
+        <w:rPr>
+          <w:rFonts w:ascii="Consolas" w:hAnsi="Consolas" w:cs="Consolas" w:eastAsia="Consolas"/>
+          <w:sz w:val="18"/>
+          <w:szCs w:val="18"/>
+        </w:rPr>
+        <w:t xml:space="preserve">beforeAll(async () =&gt; {</w:t>
+        <w:br/>
+        <w:t xml:space="preserve">  const moduleFixture: TestingModule = await Test.createTestingModule({</w:t>
+        <w:br/>
+        <w:t xml:space="preserve">    imports: [AppModule],</w:t>
+        <w:br/>
+        <w:t xml:space="preserve">  }).compile();</w:t>
+        <w:br/>
+        <w:t xml:space="preserve"/>
+        <w:br/>
+        <w:t xml:space="preserve">  app = moduleFixture.createNestApplication();</w:t>
+        <w:br/>
+        <w:t xml:space="preserve">  process.env.CORS_ORIGIN = 'http://localhost:5173';</w:t>
+        <w:br/>
+        <w:t xml:space="preserve">  configurarApp(app);</w:t>
+        <w:br/>
+        <w:t xml:space="preserve">  await app.init();</w:t>
+        <w:br/>
+        <w:t xml:space="preserve">});</w:t>
+      </w:r>
+    </w:p>
+    <w:p>
+      <w:pPr>
+        <w:keepNext/>
+        <w:spacing w:before="120" w:after="80"/>
+      </w:pPr>
+      <w:r>
+        <w:rPr>
+          <w:b/>
+          <w:bCs/>
+        </w:rPr>
+        <w:t xml:space="preserve">Exemplo de teste e2e: duas assunções simultâneas, uma vence e o banco confirma um único responsável (test/app.e2e-spec.ts)</w:t>
+      </w:r>
+    </w:p>
+    <w:p>
+      <w:pPr>
+        <w:pBdr>
+          <w:top w:val="single" w:sz="4" w:space="4" w:color="D0D0D0"/>
+          <w:left w:val="single" w:sz="4" w:space="4" w:color="D0D0D0"/>
+          <w:bottom w:val="single" w:sz="4" w:space="4" w:color="D0D0D0"/>
+          <w:right w:val="single" w:sz="4" w:space="4" w:color="D0D0D0"/>
+        </w:pBdr>
+        <w:shd w:val="clear" w:color="auto" w:fill="F5F5F5"/>
+        <w:spacing w:after="160" w:line="240" w:lineRule="auto"/>
+        <w:ind w:left="113" w:right="113"/>
+      </w:pPr>
+      <w:r>
+        <w:rPr>
+          <w:rFonts w:ascii="Consolas" w:hAnsi="Consolas" w:cs="Consolas" w:eastAsia="Consolas"/>
+          <w:sz w:val="18"/>
+          <w:szCs w:val="18"/>
+        </w:rPr>
+        <w:t xml:space="preserve">it('duas assunções simultâneas: uma passa (200) e a outra perde (409)', async () =&gt; {</w:t>
+        <w:br/>
+        <w:t xml:space="preserve">  const codigo = await criar('Dono corrida');</w:t>
+        <w:br/>
+        <w:t xml:space="preserve"/>
+        <w:br/>
+        <w:t xml:space="preserve">  const respostas = await Promise.all([</w:t>
+        <w:br/>
+        <w:t xml:space="preserve">    mudarStatus(atendente, codigo, 'EM_ATENDIMENTO'),</w:t>
+        <w:br/>
+        <w:t xml:space="preserve">    mudarStatus(atendente2, codigo, 'EM_ATENDIMENTO'),</w:t>
+        <w:br/>
+        <w:t xml:space="preserve">  ]);</w:t>
+        <w:br/>
+        <w:t xml:space="preserve">  const statuses = respostas.map((r) =&gt; r.status).sort();</w:t>
+        <w:br/>
+        <w:t xml:space="preserve"/>
+        <w:br/>
+        <w:t xml:space="preserve">  expect(statuses).toEqual([200, 409]);</w:t>
+        <w:br/>
+        <w:t xml:space="preserve">  const assuncoes = await app.get(PrismaService).historicoSolicitacao.findMany({</w:t>
+        <w:br/>
+        <w:t xml:space="preserve">    where: { solicitacaoCodigo: codigo, statusNovo: 'EM_ATENDIMENTO' },</w:t>
+        <w:br/>
+        <w:t xml:space="preserve">  });</w:t>
+        <w:br/>
+        <w:t xml:space="preserve">  expect(assuncoes).toHaveLength(1); // uma só linha: não há dois responsáveis</w:t>
+        <w:br/>
+        <w:t xml:space="preserve">});</w:t>
+      </w:r>
+    </w:p>
+    <w:p>
+      <w:pPr>
+        <w:spacing w:after="160"/>
+        <w:jc w:val="both"/>
+      </w:pPr>
+      <w:r>
+        <w:t xml:space="preserve">O front-end ainda não possui testes automatizados, o que está registrado nas limitações da solução (seção 6.1).</w:t>
+      </w:r>
     </w:p>
     <w:p>
       <w:pPr>

</xml_diff>